<commit_message>
Add Phase 2: Position request module
Introduce Phase 2 position-request workflow: new JPA models (PositionRequest, PositionDocument, PositionStatusHistory), enum (PositionRequestStatus), repositories, services (PositionRequestService, PositionEmailService) and document generation support. Add admin and applicant controllers with request listing, detail views, document form handling, status updates and submission flows. Integrate position data into AcademicAdminController and extend DocumentGenerationService to generate Phase2 DOCX templates. Add Thymeleaf templates and DOCX templates/assets, tests, and small runtime/logging/error-handling improvements. Also add .gitignore and sonar storage DB file.
</commit_message>
<xml_diff>
--- a/shopping-cart-spring-boot-main/uploads/academic/2/doc_6.docx
+++ b/shopping-cart-spring-boot-main/uploads/academic/2/doc_6.docx
@@ -2746,7 +2746,7 @@
                 <w:sz w:val="24"/>
                 <w:szCs w:val="24"/>
               </w:rPr>
-              <w:t>๒.๐</w:t>
+              <w:t/>
             </w:r>
           </w:p>
         </w:tc>
@@ -2827,7 +2827,7 @@
                 <w:sz w:val="24"/>
                 <w:szCs w:val="24"/>
               </w:rPr>
-              <w:t/>
+              <w:t>๕.๐</w:t>
             </w:r>
           </w:p>
         </w:tc>
@@ -2884,7 +2884,7 @@
                 <w:sz w:val="24"/>
                 <w:szCs w:val="24"/>
               </w:rPr>
-              <w:t>๘.๐๐</w:t>
+              <w:t>๒๐.๐๐</w:t>
             </w:r>
           </w:p>
         </w:tc>
@@ -3174,7 +3174,7 @@
                 <w:sz w:val="24"/>
                 <w:szCs w:val="24"/>
               </w:rPr>
-              <w:t>๔๙.๔๐</w:t>
+              <w:t>๖๑.๔๐</w:t>
             </w:r>
           </w:p>
         </w:tc>
@@ -3305,53 +3305,53 @@
         <w:rPr>
           <w:rFonts w:ascii="MS Gothic" w:eastAsia="MS Gothic" w:hAnsi="MS Gothic"/>
         </w:rPr>
+        <w:t>☐</w:t>
+      </w:r>
+      <w:r>
+        <w:rPr>
+          <w:rFonts w:ascii="TH Sarabun New" w:hAnsi="TH Sarabun New" w:cs="TH Sarabun New"/>
+        </w:rPr>
+        <w:t xml:space="preserve"/>
+      </w:r>
+      <w:r>
+        <w:rPr>
+          <w:rFonts w:ascii="TH Sarabun New" w:hAnsi="TH Sarabun New" w:cs="TH Sarabun New"/>
+          <w:sz w:val="20"/>
+          <w:szCs w:val="20"/>
+          <w:cs/>
+        </w:rPr>
+        <w:t xml:space="preserve"> ไม่ผ่าน</w:t>
+      </w:r>
+      <w:r>
+        <w:rPr>
+          <w:rFonts w:ascii="TH Sarabun New" w:hAnsi="TH Sarabun New" w:cs="TH Sarabun New"/>
+          <w:sz w:val="20"/>
+          <w:szCs w:val="20"/>
+        </w:rPr>
+        <w:t xml:space="preserve"> </w:t>
+      </w:r>
+      <w:r>
+        <w:rPr>
+          <w:rFonts w:ascii="TH Sarabun New" w:hAnsi="TH Sarabun New" w:cs="TH Sarabun New"/>
+          <w:sz w:val="20"/>
+          <w:szCs w:val="20"/>
+          <w:cs/>
+        </w:rPr>
+        <w:t xml:space="preserve"> </w:t>
+      </w:r>
+      <w:r>
+        <w:rPr>
+          <w:rFonts w:ascii="TH Sarabun New" w:hAnsi="TH Sarabun New" w:cs="TH Sarabun New"/>
+          <w:sz w:val="20"/>
+          <w:szCs w:val="20"/>
+        </w:rPr>
+        <w:t/>
+      </w:r>
+      <w:r>
+        <w:rPr>
+          <w:rFonts w:ascii="MS Gothic" w:eastAsia="MS Gothic" w:hAnsi="MS Gothic"/>
+        </w:rPr>
         <w:t>☑</w:t>
-      </w:r>
-      <w:r>
-        <w:rPr>
-          <w:rFonts w:ascii="TH Sarabun New" w:hAnsi="TH Sarabun New" w:cs="TH Sarabun New"/>
-        </w:rPr>
-        <w:t xml:space="preserve"/>
-      </w:r>
-      <w:r>
-        <w:rPr>
-          <w:rFonts w:ascii="TH Sarabun New" w:hAnsi="TH Sarabun New" w:cs="TH Sarabun New"/>
-          <w:sz w:val="20"/>
-          <w:szCs w:val="20"/>
-          <w:cs/>
-        </w:rPr>
-        <w:t xml:space="preserve"> ไม่ผ่าน</w:t>
-      </w:r>
-      <w:r>
-        <w:rPr>
-          <w:rFonts w:ascii="TH Sarabun New" w:hAnsi="TH Sarabun New" w:cs="TH Sarabun New"/>
-          <w:sz w:val="20"/>
-          <w:szCs w:val="20"/>
-        </w:rPr>
-        <w:t xml:space="preserve"> </w:t>
-      </w:r>
-      <w:r>
-        <w:rPr>
-          <w:rFonts w:ascii="TH Sarabun New" w:hAnsi="TH Sarabun New" w:cs="TH Sarabun New"/>
-          <w:sz w:val="20"/>
-          <w:szCs w:val="20"/>
-          <w:cs/>
-        </w:rPr>
-        <w:t xml:space="preserve"> </w:t>
-      </w:r>
-      <w:r>
-        <w:rPr>
-          <w:rFonts w:ascii="TH Sarabun New" w:hAnsi="TH Sarabun New" w:cs="TH Sarabun New"/>
-          <w:sz w:val="20"/>
-          <w:szCs w:val="20"/>
-        </w:rPr>
-        <w:t/>
-      </w:r>
-      <w:r>
-        <w:rPr>
-          <w:rFonts w:ascii="MS Gothic" w:eastAsia="MS Gothic" w:hAnsi="MS Gothic"/>
-        </w:rPr>
-        <w:t>☐</w:t>
       </w:r>
       <w:r>
         <w:rPr>
@@ -4297,7 +4297,7 @@
           <w:sz w:val="20"/>
           <w:szCs w:val="20"/>
         </w:rPr>
-        <w:t>๘.๐๐</w:t>
+        <w:t>๒๐.๐๐</w:t>
       </w:r>
       <w:r>
         <w:rPr>
@@ -4386,7 +4386,7 @@
           <w:sz w:val="20"/>
           <w:szCs w:val="20"/>
         </w:rPr>
-        <w:t>๔๙.๔๐</w:t>
+        <w:t>๖๑.๔๐</w:t>
       </w:r>
       <w:r>
         <w:rPr>

</xml_diff>